<commit_message>
Final commit prior to first submission
</commit_message>
<xml_diff>
--- a/bibfiles/reference-doc.docx
+++ b/bibfiles/reference-doc.docx
@@ -178,7 +178,10 @@
     <w:sectPr>
       <w:headerReference w:type="even" r:id="rId7"/>
       <w:headerReference w:type="default" r:id="rId8"/>
-      <w:headerReference w:type="first" r:id="rId9"/>
+      <w:footerReference w:type="even" r:id="rId9"/>
+      <w:footerReference w:type="default" r:id="rId10"/>
+      <w:headerReference w:type="first" r:id="rId11"/>
+      <w:footerReference w:type="first" r:id="rId12"/>
       <w:pgSz w:w="12240" w:h="15840"/>
       <w:pgMar w:top="1440" w:right="1440" w:bottom="1440" w:left="1440" w:header="720" w:footer="720" w:gutter="0"/>
       <w:cols w:space="720"/>
@@ -208,6 +211,36 @@
 </w:endnotes>
 </file>
 
+<file path=word/footer1.xml><?xml version="1.0" encoding="utf-8"?>
+<w:ftr xmlns:wpc="http://schemas.microsoft.com/office/word/2010/wordprocessingCanvas" xmlns:cx="http://schemas.microsoft.com/office/drawing/2014/chartex" xmlns:cx1="http://schemas.microsoft.com/office/drawing/2015/9/8/chartex" xmlns:cx2="http://schemas.microsoft.com/office/drawing/2015/10/21/chartex" xmlns:cx3="http://schemas.microsoft.com/office/drawing/2016/5/9/chartex" xmlns:cx4="http://schemas.microsoft.com/office/drawing/2016/5/10/chartex" xmlns:cx5="http://schemas.microsoft.com/office/drawing/2016/5/11/chartex" xmlns:cx6="http://schemas.microsoft.com/office/drawing/2016/5/12/chartex" xmlns:cx7="http://schemas.microsoft.com/office/drawing/2016/5/13/chartex" xmlns:cx8="http://schemas.microsoft.com/office/drawing/2016/5/14/chartex" xmlns:mc="http://schemas.openxmlformats.org/markup-compatibility/2006" xmlns:aink="http://schemas.microsoft.com/office/drawing/2016/ink" xmlns:am3d="http://schemas.microsoft.com/office/drawing/2017/model3d" xmlns:o="urn:schemas-microsoft-com:office:office" xmlns:oel="http://schemas.microsoft.com/office/2019/extlst" xmlns:r="http://schemas.openxmlformats.org/officeDocument/2006/relationships" xmlns:m="http://schemas.openxmlformats.org/officeDocument/2006/math" xmlns:v="urn:schemas-microsoft-com:vml" xmlns:wp14="http://schemas.microsoft.com/office/word/2010/wordprocessingDrawing" xmlns:wp="http://schemas.openxmlformats.org/drawingml/2006/wordprocessingDrawing" xmlns:w10="urn:schemas-microsoft-com:office:word" xmlns:w="http://schemas.openxmlformats.org/wordprocessingml/2006/main" xmlns:w14="http://schemas.microsoft.com/office/word/2010/wordml" xmlns:w15="http://schemas.microsoft.com/office/word/2012/wordml" xmlns:w16cex="http://schemas.microsoft.com/office/word/2018/wordml/cex" xmlns:w16cid="http://schemas.microsoft.com/office/word/2016/wordml/cid" xmlns:w16="http://schemas.microsoft.com/office/word/2018/wordml" xmlns:w16du="http://schemas.microsoft.com/office/word/2023/wordml/word16du" xmlns:w16sdtdh="http://schemas.microsoft.com/office/word/2020/wordml/sdtdatahash" xmlns:w16sdtfl="http://schemas.microsoft.com/office/word/2024/wordml/sdtformatlock" xmlns:w16se="http://schemas.microsoft.com/office/word/2015/wordml/symex" xmlns:wpg="http://schemas.microsoft.com/office/word/2010/wordprocessingGroup" xmlns:wpi="http://schemas.microsoft.com/office/word/2010/wordprocessingInk" xmlns:wne="http://schemas.microsoft.com/office/word/2006/wordml" xmlns:wps="http://schemas.microsoft.com/office/word/2010/wordprocessingShape" mc:Ignorable="w14 w15 w16se w16cid w16 w16cex w16sdtdh w16sdtfl w16du wp14">
+  <w:p>
+    <w:pPr>
+      <w:pStyle w:val="Footer"/>
+    </w:pPr>
+  </w:p>
+</w:ftr>
+</file>
+
+<file path=word/footer2.xml><?xml version="1.0" encoding="utf-8"?>
+<w:ftr xmlns:wpc="http://schemas.microsoft.com/office/word/2010/wordprocessingCanvas" xmlns:cx="http://schemas.microsoft.com/office/drawing/2014/chartex" xmlns:cx1="http://schemas.microsoft.com/office/drawing/2015/9/8/chartex" xmlns:cx2="http://schemas.microsoft.com/office/drawing/2015/10/21/chartex" xmlns:cx3="http://schemas.microsoft.com/office/drawing/2016/5/9/chartex" xmlns:cx4="http://schemas.microsoft.com/office/drawing/2016/5/10/chartex" xmlns:cx5="http://schemas.microsoft.com/office/drawing/2016/5/11/chartex" xmlns:cx6="http://schemas.microsoft.com/office/drawing/2016/5/12/chartex" xmlns:cx7="http://schemas.microsoft.com/office/drawing/2016/5/13/chartex" xmlns:cx8="http://schemas.microsoft.com/office/drawing/2016/5/14/chartex" xmlns:mc="http://schemas.openxmlformats.org/markup-compatibility/2006" xmlns:aink="http://schemas.microsoft.com/office/drawing/2016/ink" xmlns:am3d="http://schemas.microsoft.com/office/drawing/2017/model3d" xmlns:o="urn:schemas-microsoft-com:office:office" xmlns:oel="http://schemas.microsoft.com/office/2019/extlst" xmlns:r="http://schemas.openxmlformats.org/officeDocument/2006/relationships" xmlns:m="http://schemas.openxmlformats.org/officeDocument/2006/math" xmlns:v="urn:schemas-microsoft-com:vml" xmlns:wp14="http://schemas.microsoft.com/office/word/2010/wordprocessingDrawing" xmlns:wp="http://schemas.openxmlformats.org/drawingml/2006/wordprocessingDrawing" xmlns:w10="urn:schemas-microsoft-com:office:word" xmlns:w="http://schemas.openxmlformats.org/wordprocessingml/2006/main" xmlns:w14="http://schemas.microsoft.com/office/word/2010/wordml" xmlns:w15="http://schemas.microsoft.com/office/word/2012/wordml" xmlns:w16cex="http://schemas.microsoft.com/office/word/2018/wordml/cex" xmlns:w16cid="http://schemas.microsoft.com/office/word/2016/wordml/cid" xmlns:w16="http://schemas.microsoft.com/office/word/2018/wordml" xmlns:w16du="http://schemas.microsoft.com/office/word/2023/wordml/word16du" xmlns:w16sdtdh="http://schemas.microsoft.com/office/word/2020/wordml/sdtdatahash" xmlns:w16sdtfl="http://schemas.microsoft.com/office/word/2024/wordml/sdtformatlock" xmlns:w16se="http://schemas.microsoft.com/office/word/2015/wordml/symex" xmlns:wpg="http://schemas.microsoft.com/office/word/2010/wordprocessingGroup" xmlns:wpi="http://schemas.microsoft.com/office/word/2010/wordprocessingInk" xmlns:wne="http://schemas.microsoft.com/office/word/2006/wordml" xmlns:wps="http://schemas.microsoft.com/office/word/2010/wordprocessingShape" mc:Ignorable="w14 w15 w16se w16cid w16 w16cex w16sdtdh w16sdtfl w16du wp14">
+  <w:p>
+    <w:pPr>
+      <w:pStyle w:val="Footer"/>
+    </w:pPr>
+  </w:p>
+</w:ftr>
+</file>
+
+<file path=word/footer3.xml><?xml version="1.0" encoding="utf-8"?>
+<w:ftr xmlns:wpc="http://schemas.microsoft.com/office/word/2010/wordprocessingCanvas" xmlns:cx="http://schemas.microsoft.com/office/drawing/2014/chartex" xmlns:cx1="http://schemas.microsoft.com/office/drawing/2015/9/8/chartex" xmlns:cx2="http://schemas.microsoft.com/office/drawing/2015/10/21/chartex" xmlns:cx3="http://schemas.microsoft.com/office/drawing/2016/5/9/chartex" xmlns:cx4="http://schemas.microsoft.com/office/drawing/2016/5/10/chartex" xmlns:cx5="http://schemas.microsoft.com/office/drawing/2016/5/11/chartex" xmlns:cx6="http://schemas.microsoft.com/office/drawing/2016/5/12/chartex" xmlns:cx7="http://schemas.microsoft.com/office/drawing/2016/5/13/chartex" xmlns:cx8="http://schemas.microsoft.com/office/drawing/2016/5/14/chartex" xmlns:mc="http://schemas.openxmlformats.org/markup-compatibility/2006" xmlns:aink="http://schemas.microsoft.com/office/drawing/2016/ink" xmlns:am3d="http://schemas.microsoft.com/office/drawing/2017/model3d" xmlns:o="urn:schemas-microsoft-com:office:office" xmlns:oel="http://schemas.microsoft.com/office/2019/extlst" xmlns:r="http://schemas.openxmlformats.org/officeDocument/2006/relationships" xmlns:m="http://schemas.openxmlformats.org/officeDocument/2006/math" xmlns:v="urn:schemas-microsoft-com:vml" xmlns:wp14="http://schemas.microsoft.com/office/word/2010/wordprocessingDrawing" xmlns:wp="http://schemas.openxmlformats.org/drawingml/2006/wordprocessingDrawing" xmlns:w10="urn:schemas-microsoft-com:office:word" xmlns:w="http://schemas.openxmlformats.org/wordprocessingml/2006/main" xmlns:w14="http://schemas.microsoft.com/office/word/2010/wordml" xmlns:w15="http://schemas.microsoft.com/office/word/2012/wordml" xmlns:w16cex="http://schemas.microsoft.com/office/word/2018/wordml/cex" xmlns:w16cid="http://schemas.microsoft.com/office/word/2016/wordml/cid" xmlns:w16="http://schemas.microsoft.com/office/word/2018/wordml" xmlns:w16du="http://schemas.microsoft.com/office/word/2023/wordml/word16du" xmlns:w16sdtdh="http://schemas.microsoft.com/office/word/2020/wordml/sdtdatahash" xmlns:w16sdtfl="http://schemas.microsoft.com/office/word/2024/wordml/sdtformatlock" xmlns:w16se="http://schemas.microsoft.com/office/word/2015/wordml/symex" xmlns:wpg="http://schemas.microsoft.com/office/word/2010/wordprocessingGroup" xmlns:wpi="http://schemas.microsoft.com/office/word/2010/wordprocessingInk" xmlns:wne="http://schemas.microsoft.com/office/word/2006/wordml" xmlns:wps="http://schemas.microsoft.com/office/word/2010/wordprocessingShape" mc:Ignorable="w14 w15 w16se w16cid w16 w16cex w16sdtdh w16sdtfl w16du wp14">
+  <w:p>
+    <w:pPr>
+      <w:pStyle w:val="Footer"/>
+    </w:pPr>
+  </w:p>
+</w:ftr>
+</file>
+
 <file path=word/footnotes.xml><?xml version="1.0" encoding="utf-8"?>
 <w:footnotes xmlns:wpc="http://schemas.microsoft.com/office/word/2010/wordprocessingCanvas" xmlns:cx="http://schemas.microsoft.com/office/drawing/2014/chartex" xmlns:cx1="http://schemas.microsoft.com/office/drawing/2015/9/8/chartex" xmlns:cx2="http://schemas.microsoft.com/office/drawing/2015/10/21/chartex" xmlns:cx3="http://schemas.microsoft.com/office/drawing/2016/5/9/chartex" xmlns:cx4="http://schemas.microsoft.com/office/drawing/2016/5/10/chartex" xmlns:cx5="http://schemas.microsoft.com/office/drawing/2016/5/11/chartex" xmlns:cx6="http://schemas.microsoft.com/office/drawing/2016/5/12/chartex" xmlns:cx7="http://schemas.microsoft.com/office/drawing/2016/5/13/chartex" xmlns:cx8="http://schemas.microsoft.com/office/drawing/2016/5/14/chartex" xmlns:mc="http://schemas.openxmlformats.org/markup-compatibility/2006" xmlns:aink="http://schemas.microsoft.com/office/drawing/2016/ink" xmlns:am3d="http://schemas.microsoft.com/office/drawing/2017/model3d" xmlns:o="urn:schemas-microsoft-com:office:office" xmlns:oel="http://schemas.microsoft.com/office/2019/extlst" xmlns:r="http://schemas.openxmlformats.org/officeDocument/2006/relationships" xmlns:m="http://schemas.openxmlformats.org/officeDocument/2006/math" xmlns:v="urn:schemas-microsoft-com:vml" xmlns:wp14="http://schemas.microsoft.com/office/word/2010/wordprocessingDrawing" xmlns:wp="http://schemas.openxmlformats.org/drawingml/2006/wordprocessingDrawing" xmlns:w10="urn:schemas-microsoft-com:office:word" xmlns:w="http://schemas.openxmlformats.org/wordprocessingml/2006/main" xmlns:w14="http://schemas.microsoft.com/office/word/2010/wordml" xmlns:w15="http://schemas.microsoft.com/office/word/2012/wordml" xmlns:w16cex="http://schemas.microsoft.com/office/word/2018/wordml/cex" xmlns:w16cid="http://schemas.microsoft.com/office/word/2016/wordml/cid" xmlns:w16="http://schemas.microsoft.com/office/word/2018/wordml" xmlns:w16du="http://schemas.microsoft.com/office/word/2023/wordml/word16du" xmlns:w16sdtdh="http://schemas.microsoft.com/office/word/2020/wordml/sdtdatahash" xmlns:w16sdtfl="http://schemas.microsoft.com/office/word/2024/wordml/sdtformatlock" xmlns:w16se="http://schemas.microsoft.com/office/word/2015/wordml/symex" xmlns:wpg="http://schemas.microsoft.com/office/word/2010/wordprocessingGroup" xmlns:wpi="http://schemas.microsoft.com/office/word/2010/wordprocessingInk" xmlns:wne="http://schemas.microsoft.com/office/word/2006/wordml" xmlns:wps="http://schemas.microsoft.com/office/word/2010/wordprocessingShape" mc:Ignorable="w14 w15 w16se w16cid w16 w16cex w16sdtdh w16sdtfl w16du wp14">
   <w:footnote w:type="separator" w:id="-1">
@@ -240,6 +273,11 @@
         <w:docPartUnique/>
       </w:docPartObj>
     </w:sdtPr>
+    <w:sdtEndPr>
+      <w:rPr>
+        <w:rStyle w:val="PageNumber"/>
+      </w:rPr>
+    </w:sdtEndPr>
     <w:sdtContent>
       <w:p>
         <w:pPr>
@@ -292,6 +330,11 @@
         <w:docPartUnique/>
       </w:docPartObj>
     </w:sdtPr>
+    <w:sdtEndPr>
+      <w:rPr>
+        <w:rStyle w:val="PageNumber"/>
+      </w:rPr>
+    </w:sdtEndPr>
     <w:sdtContent>
       <w:p>
         <w:pPr>
@@ -340,7 +383,7 @@
       <w:ind w:right="360"/>
     </w:pPr>
     <w:r>
-      <w:t>ADVERSITY AND EXECUTIVE FUNCTIONING</w:t>
+      <w:t>UNPACKING DIF IN EXECUTIVE FUNCTIONING PERFORMANCE</w:t>
     </w:r>
   </w:p>
 </w:hdr>
@@ -356,7 +399,7 @@
       <w:t xml:space="preserve">RUNNING HEAD: </w:t>
     </w:r>
     <w:r>
-      <w:t>Inhibition and attention shifting</w:t>
+      <w:t>unpacking DIF in executive functioning performance</w:t>
     </w:r>
   </w:p>
 </w:hdr>

</xml_diff>